<commit_message>
Regenerate TMFC002 and TMFC003 component specification documents
Root PDF, Diagrams/.docx, and eTOM-SID Links cross-reference refresh for both components
via the component-specification-documentation skill.

Co-Authored-By: Claude Sonnet 5 <noreply@anthropic.com>
</commit_message>
<xml_diff>
--- a/specifications/TMFC002-ProductOrderCaptureAndValidation/Diagrams/TMFC002_Product_Order_Capture_Validation.docx
+++ b/specifications/TMFC002-ProductOrderCaptureAndValidation/Diagrams/TMFC002_Product_Order_Capture_Validation.docx
@@ -2353,7 +2353,7 @@
       <w:r>
         <w:drawing>
           <wp:inline xmlns:a="http://schemas.openxmlformats.org/drawingml/2006/main" xmlns:pic="http://schemas.openxmlformats.org/drawingml/2006/picture">
-            <wp:extent cx="5394960" cy="5046988"/>
+            <wp:extent cx="5394960" cy="5308663"/>
             <wp:docPr id="2" name="Picture 2"/>
             <wp:cNvGraphicFramePr>
               <a:graphicFrameLocks noChangeAspect="1"/>
@@ -2374,7 +2374,7 @@
                   <pic:spPr>
                     <a:xfrm>
                       <a:off x="0" y="0"/>
-                      <a:ext cx="5394960" cy="5046988"/>
+                      <a:ext cx="5394960" cy="5308663"/>
                     </a:xfrm>
                     <a:prstGeom prst="rect"/>
                   </pic:spPr>
@@ -3503,6 +3503,142 @@
           <w:p>
             <w:r/>
             <w:r>
+              <w:t>TMF622</w:t>
+            </w:r>
+          </w:p>
+        </w:tc>
+        <w:tc>
+          <w:tcPr>
+            <w:tcW w:type="dxa" w:w="2153"/>
+          </w:tcPr>
+          <w:p>
+            <w:r/>
+            <w:r>
+              <w:t>TMF622</w:t>
+            </w:r>
+          </w:p>
+        </w:tc>
+        <w:tc>
+          <w:tcPr>
+            <w:tcW w:type="dxa" w:w="1123"/>
+          </w:tcPr>
+          <w:p>
+            <w:r/>
+            <w:r>
+              <w:t>5</w:t>
+            </w:r>
+          </w:p>
+        </w:tc>
+        <w:tc>
+          <w:tcPr>
+            <w:tcW w:type="dxa" w:w="1498"/>
+          </w:tcPr>
+          <w:p>
+            <w:r/>
+            <w:r>
+              <w:t>Mandatory</w:t>
+            </w:r>
+          </w:p>
+        </w:tc>
+        <w:tc>
+          <w:tcPr>
+            <w:tcW w:type="dxa" w:w="1778"/>
+          </w:tcPr>
+          <w:p>
+            <w:r/>
+            <w:r>
+              <w:t>productOrder</w:t>
+            </w:r>
+          </w:p>
+        </w:tc>
+        <w:tc>
+          <w:tcPr>
+            <w:tcW w:type="dxa" w:w="1872"/>
+          </w:tcPr>
+          <w:p>
+            <w:r/>
+            <w:r>
+              <w:t>GET, GET /id, POST</w:t>
+            </w:r>
+          </w:p>
+        </w:tc>
+      </w:tr>
+      <w:tr>
+        <w:tc>
+          <w:tcPr>
+            <w:tcW w:type="dxa" w:w="936"/>
+          </w:tcPr>
+          <w:p>
+            <w:r/>
+            <w:r>
+              <w:t>TMF622</w:t>
+            </w:r>
+          </w:p>
+        </w:tc>
+        <w:tc>
+          <w:tcPr>
+            <w:tcW w:type="dxa" w:w="2153"/>
+          </w:tcPr>
+          <w:p>
+            <w:r/>
+            <w:r>
+              <w:t>TMF622</w:t>
+            </w:r>
+          </w:p>
+        </w:tc>
+        <w:tc>
+          <w:tcPr>
+            <w:tcW w:type="dxa" w:w="1123"/>
+          </w:tcPr>
+          <w:p>
+            <w:r/>
+            <w:r>
+              <w:t>4</w:t>
+            </w:r>
+          </w:p>
+        </w:tc>
+        <w:tc>
+          <w:tcPr>
+            <w:tcW w:type="dxa" w:w="1498"/>
+          </w:tcPr>
+          <w:p>
+            <w:r/>
+            <w:r>
+              <w:t>Mandatory</w:t>
+            </w:r>
+          </w:p>
+        </w:tc>
+        <w:tc>
+          <w:tcPr>
+            <w:tcW w:type="dxa" w:w="1778"/>
+          </w:tcPr>
+          <w:p>
+            <w:r/>
+            <w:r>
+              <w:t>productOrder</w:t>
+            </w:r>
+          </w:p>
+        </w:tc>
+        <w:tc>
+          <w:tcPr>
+            <w:tcW w:type="dxa" w:w="1872"/>
+          </w:tcPr>
+          <w:p>
+            <w:r/>
+            <w:r>
+              <w:t>GET, GET /id, POST</w:t>
+            </w:r>
+          </w:p>
+        </w:tc>
+      </w:tr>
+      <w:tr>
+        <w:tc>
+          <w:tcPr>
+            <w:tcW w:type="dxa" w:w="936"/>
+          </w:tcPr>
+          <w:p>
+            <w:r/>
+            <w:r>
               <w:t>TMF637</w:t>
             </w:r>
           </w:p>
@@ -5813,7 +5949,7 @@
       <w:r>
         <w:drawing>
           <wp:inline xmlns:a="http://schemas.openxmlformats.org/drawingml/2006/main" xmlns:pic="http://schemas.openxmlformats.org/drawingml/2006/picture">
-            <wp:extent cx="5394960" cy="5511064"/>
+            <wp:extent cx="5394960" cy="6122544"/>
             <wp:docPr id="4" name="Picture 4"/>
             <wp:cNvGraphicFramePr>
               <a:graphicFrameLocks noChangeAspect="1"/>
@@ -5834,7 +5970,7 @@
                   <pic:spPr>
                     <a:xfrm>
                       <a:off x="0" y="0"/>
-                      <a:ext cx="5394960" cy="5511064"/>
+                      <a:ext cx="5394960" cy="6122544"/>
                     </a:xfrm>
                     <a:prstGeom prst="rect"/>
                   </pic:spPr>

</xml_diff>

<commit_message>
Regenerate TMFC002 and TMFC003 component specification documents (#39)
Root PDF, Diagrams/.docx, and eTOM-SID Links cross-reference refresh for both components
via the component-specification-documentation skill.

Co-authored-by: Claude Sonnet 5 <noreply@anthropic.com>
</commit_message>
<xml_diff>
--- a/specifications/TMFC002-ProductOrderCaptureAndValidation/Diagrams/TMFC002_Product_Order_Capture_Validation.docx
+++ b/specifications/TMFC002-ProductOrderCaptureAndValidation/Diagrams/TMFC002_Product_Order_Capture_Validation.docx
@@ -2353,7 +2353,7 @@
       <w:r>
         <w:drawing>
           <wp:inline xmlns:a="http://schemas.openxmlformats.org/drawingml/2006/main" xmlns:pic="http://schemas.openxmlformats.org/drawingml/2006/picture">
-            <wp:extent cx="5394960" cy="5046988"/>
+            <wp:extent cx="5394960" cy="5308663"/>
             <wp:docPr id="2" name="Picture 2"/>
             <wp:cNvGraphicFramePr>
               <a:graphicFrameLocks noChangeAspect="1"/>
@@ -2374,7 +2374,7 @@
                   <pic:spPr>
                     <a:xfrm>
                       <a:off x="0" y="0"/>
-                      <a:ext cx="5394960" cy="5046988"/>
+                      <a:ext cx="5394960" cy="5308663"/>
                     </a:xfrm>
                     <a:prstGeom prst="rect"/>
                   </pic:spPr>
@@ -3503,6 +3503,142 @@
           <w:p>
             <w:r/>
             <w:r>
+              <w:t>TMF622</w:t>
+            </w:r>
+          </w:p>
+        </w:tc>
+        <w:tc>
+          <w:tcPr>
+            <w:tcW w:type="dxa" w:w="2153"/>
+          </w:tcPr>
+          <w:p>
+            <w:r/>
+            <w:r>
+              <w:t>TMF622</w:t>
+            </w:r>
+          </w:p>
+        </w:tc>
+        <w:tc>
+          <w:tcPr>
+            <w:tcW w:type="dxa" w:w="1123"/>
+          </w:tcPr>
+          <w:p>
+            <w:r/>
+            <w:r>
+              <w:t>5</w:t>
+            </w:r>
+          </w:p>
+        </w:tc>
+        <w:tc>
+          <w:tcPr>
+            <w:tcW w:type="dxa" w:w="1498"/>
+          </w:tcPr>
+          <w:p>
+            <w:r/>
+            <w:r>
+              <w:t>Mandatory</w:t>
+            </w:r>
+          </w:p>
+        </w:tc>
+        <w:tc>
+          <w:tcPr>
+            <w:tcW w:type="dxa" w:w="1778"/>
+          </w:tcPr>
+          <w:p>
+            <w:r/>
+            <w:r>
+              <w:t>productOrder</w:t>
+            </w:r>
+          </w:p>
+        </w:tc>
+        <w:tc>
+          <w:tcPr>
+            <w:tcW w:type="dxa" w:w="1872"/>
+          </w:tcPr>
+          <w:p>
+            <w:r/>
+            <w:r>
+              <w:t>GET, GET /id, POST</w:t>
+            </w:r>
+          </w:p>
+        </w:tc>
+      </w:tr>
+      <w:tr>
+        <w:tc>
+          <w:tcPr>
+            <w:tcW w:type="dxa" w:w="936"/>
+          </w:tcPr>
+          <w:p>
+            <w:r/>
+            <w:r>
+              <w:t>TMF622</w:t>
+            </w:r>
+          </w:p>
+        </w:tc>
+        <w:tc>
+          <w:tcPr>
+            <w:tcW w:type="dxa" w:w="2153"/>
+          </w:tcPr>
+          <w:p>
+            <w:r/>
+            <w:r>
+              <w:t>TMF622</w:t>
+            </w:r>
+          </w:p>
+        </w:tc>
+        <w:tc>
+          <w:tcPr>
+            <w:tcW w:type="dxa" w:w="1123"/>
+          </w:tcPr>
+          <w:p>
+            <w:r/>
+            <w:r>
+              <w:t>4</w:t>
+            </w:r>
+          </w:p>
+        </w:tc>
+        <w:tc>
+          <w:tcPr>
+            <w:tcW w:type="dxa" w:w="1498"/>
+          </w:tcPr>
+          <w:p>
+            <w:r/>
+            <w:r>
+              <w:t>Mandatory</w:t>
+            </w:r>
+          </w:p>
+        </w:tc>
+        <w:tc>
+          <w:tcPr>
+            <w:tcW w:type="dxa" w:w="1778"/>
+          </w:tcPr>
+          <w:p>
+            <w:r/>
+            <w:r>
+              <w:t>productOrder</w:t>
+            </w:r>
+          </w:p>
+        </w:tc>
+        <w:tc>
+          <w:tcPr>
+            <w:tcW w:type="dxa" w:w="1872"/>
+          </w:tcPr>
+          <w:p>
+            <w:r/>
+            <w:r>
+              <w:t>GET, GET /id, POST</w:t>
+            </w:r>
+          </w:p>
+        </w:tc>
+      </w:tr>
+      <w:tr>
+        <w:tc>
+          <w:tcPr>
+            <w:tcW w:type="dxa" w:w="936"/>
+          </w:tcPr>
+          <w:p>
+            <w:r/>
+            <w:r>
               <w:t>TMF637</w:t>
             </w:r>
           </w:p>
@@ -5813,7 +5949,7 @@
       <w:r>
         <w:drawing>
           <wp:inline xmlns:a="http://schemas.openxmlformats.org/drawingml/2006/main" xmlns:pic="http://schemas.openxmlformats.org/drawingml/2006/picture">
-            <wp:extent cx="5394960" cy="5511064"/>
+            <wp:extent cx="5394960" cy="6122544"/>
             <wp:docPr id="4" name="Picture 4"/>
             <wp:cNvGraphicFramePr>
               <a:graphicFrameLocks noChangeAspect="1"/>
@@ -5834,7 +5970,7 @@
                   <pic:spPr>
                     <a:xfrm>
                       <a:off x="0" y="0"/>
-                      <a:ext cx="5394960" cy="5511064"/>
+                      <a:ext cx="5394960" cy="6122544"/>
                     </a:xfrm>
                     <a:prstGeom prst="rect"/>
                   </pic:spPr>

</xml_diff>

<commit_message>
Regenerate all 34 component specification documents (#40)
Root PDF, Diagrams/.docx, and eTOM-SID Links cross-reference refresh for every component,
picking up the YAML event-content fixes (typo, true-duplicate merges, missing/mismatched
names, apiIndex.json version alignment) via the component-specification-documentation skill.

Co-authored-by: Claude Sonnet 5 <noreply@anthropic.com>
</commit_message>
<xml_diff>
--- a/specifications/TMFC002-ProductOrderCaptureAndValidation/Diagrams/TMFC002_Product_Order_Capture_Validation.docx
+++ b/specifications/TMFC002-ProductOrderCaptureAndValidation/Diagrams/TMFC002_Product_Order_Capture_Validation.docx
@@ -6316,7 +6316,7 @@
       <w:r>
         <w:drawing>
           <wp:inline xmlns:a="http://schemas.openxmlformats.org/drawingml/2006/main" xmlns:pic="http://schemas.openxmlformats.org/drawingml/2006/picture">
-            <wp:extent cx="5394960" cy="2367572"/>
+            <wp:extent cx="5394960" cy="2237207"/>
             <wp:docPr id="6" name="Picture 6"/>
             <wp:cNvGraphicFramePr>
               <a:graphicFrameLocks noChangeAspect="1"/>
@@ -6337,7 +6337,7 @@
                   <pic:spPr>
                     <a:xfrm>
                       <a:off x="0" y="0"/>
-                      <a:ext cx="5394960" cy="2367572"/>
+                      <a:ext cx="5394960" cy="2237207"/>
                     </a:xfrm>
                     <a:prstGeom prst="rect"/>
                   </pic:spPr>
@@ -6625,7 +6625,7 @@
       <w:r>
         <w:drawing>
           <wp:inline xmlns:a="http://schemas.openxmlformats.org/drawingml/2006/main" xmlns:pic="http://schemas.openxmlformats.org/drawingml/2006/picture">
-            <wp:extent cx="5394960" cy="1577264"/>
+            <wp:extent cx="5394960" cy="1721294"/>
             <wp:docPr id="7" name="Picture 7"/>
             <wp:cNvGraphicFramePr>
               <a:graphicFrameLocks noChangeAspect="1"/>
@@ -6646,7 +6646,7 @@
                   <pic:spPr>
                     <a:xfrm>
                       <a:off x="0" y="0"/>
-                      <a:ext cx="5394960" cy="1577264"/>
+                      <a:ext cx="5394960" cy="1721294"/>
                     </a:xfrm>
                     <a:prstGeom prst="rect"/>
                   </pic:spPr>

</xml_diff>